<commit_message>
style(01): unify notes Word heading color (#4E7EBA) for clearer contrast vs body text
</commit_message>
<xml_diff>
--- a/01-foundations/notes/01_L1-L3_分词_资源核算_Transformer.docx
+++ b/01-foundations/notes/01_L1-L3_分词_资源核算_Transformer.docx
@@ -130,7 +130,7 @@
           <w:rFonts w:ascii="Times New Roman" w:hAnsi="Times New Roman" w:eastAsia="微软雅黑"/>
           <w:b/>
           <w:i w:val="0"/>
-          <w:color w:val="1F3964"/>
+          <w:color w:val="4E7EBA"/>
           <w:sz w:val="32"/>
         </w:rPr>
         <w:t>📖 写在前面：你现在在哪里？</w:t>
@@ -146,7 +146,7 @@
           <w:rFonts w:ascii="Times New Roman" w:hAnsi="Times New Roman" w:eastAsia="微软雅黑"/>
           <w:b/>
           <w:i w:val="0"/>
-          <w:color w:val="1F3964"/>
+          <w:color w:val="4E7EBA"/>
           <w:sz w:val="27"/>
         </w:rPr>
         <w:t>这门课在讲什么？</w:t>
@@ -240,7 +240,7 @@
           <w:rFonts w:ascii="Times New Roman" w:hAnsi="Times New Roman" w:eastAsia="微软雅黑"/>
           <w:b/>
           <w:i w:val="0"/>
-          <w:color w:val="1F3964"/>
+          <w:color w:val="4E7EBA"/>
           <w:sz w:val="27"/>
         </w:rPr>
         <w:t>你需要什么基础？</w:t>
@@ -366,7 +366,7 @@
           <w:rFonts w:ascii="Times New Roman" w:hAnsi="Times New Roman" w:eastAsia="微软雅黑"/>
           <w:b/>
           <w:i w:val="0"/>
-          <w:color w:val="1F3964"/>
+          <w:color w:val="4E7EBA"/>
           <w:sz w:val="27"/>
         </w:rPr>
         <w:t>怎么读这份文档？</w:t>
@@ -514,7 +514,7 @@
           <w:rFonts w:ascii="Times New Roman" w:hAnsi="Times New Roman" w:eastAsia="微软雅黑"/>
           <w:b/>
           <w:i w:val="0"/>
-          <w:color w:val="1F3964"/>
+          <w:color w:val="4E7EBA"/>
           <w:sz w:val="32"/>
         </w:rPr>
         <w:t>📚 术语对照表（先收藏，随时回来查）</w:t>
@@ -1613,7 +1613,7 @@
           <w:rFonts w:ascii="Times New Roman" w:hAnsi="Times New Roman" w:eastAsia="微软雅黑"/>
           <w:b/>
           <w:i w:val="0"/>
-          <w:color w:val="1F3964"/>
+          <w:color w:val="4E7EBA"/>
           <w:sz w:val="40"/>
         </w:rPr>
         <w:t>第一讲：Tokenization（分词）—— 电脑怎么"读懂"文字？</w:t>
@@ -1629,7 +1629,7 @@
           <w:rFonts w:ascii="Times New Roman" w:hAnsi="Times New Roman" w:eastAsia="微软雅黑"/>
           <w:b/>
           <w:i w:val="0"/>
-          <w:color w:val="1F3964"/>
+          <w:color w:val="4E7EBA"/>
           <w:sz w:val="32"/>
         </w:rPr>
         <w:t>1.0 前置知识：什么是语言模型？</w:t>
@@ -1645,7 +1645,7 @@
           <w:rFonts w:ascii="Times New Roman" w:hAnsi="Times New Roman" w:eastAsia="微软雅黑"/>
           <w:b/>
           <w:i w:val="0"/>
-          <w:color w:val="1F3964"/>
+          <w:color w:val="4E7EBA"/>
           <w:sz w:val="27"/>
         </w:rPr>
         <w:t>用生活例子理解</w:t>
@@ -1853,7 +1853,7 @@
           <w:rFonts w:ascii="Times New Roman" w:hAnsi="Times New Roman" w:eastAsia="微软雅黑"/>
           <w:b/>
           <w:i w:val="0"/>
-          <w:color w:val="1F3964"/>
+          <w:color w:val="4E7EBA"/>
           <w:sz w:val="27"/>
         </w:rPr>
         <w:t>语言模型的数学表达（别怕，很简单）</w:t>
@@ -1985,7 +1985,7 @@
           <w:rFonts w:ascii="Times New Roman" w:hAnsi="Times New Roman" w:eastAsia="微软雅黑"/>
           <w:b/>
           <w:i w:val="0"/>
-          <w:color w:val="1F3964"/>
+          <w:color w:val="4E7EBA"/>
           <w:sz w:val="27"/>
         </w:rPr>
         <w:t>关键问题来了</w:t>
@@ -2038,7 +2038,7 @@
           <w:rFonts w:ascii="Times New Roman" w:hAnsi="Times New Roman" w:eastAsia="微软雅黑"/>
           <w:b/>
           <w:i w:val="0"/>
-          <w:color w:val="1F3964"/>
+          <w:color w:val="4E7EBA"/>
           <w:sz w:val="32"/>
         </w:rPr>
         <w:t>1.1 为什么需要 Tokenization？</w:t>
@@ -2054,7 +2054,7 @@
           <w:rFonts w:ascii="Times New Roman" w:hAnsi="Times New Roman" w:eastAsia="微软雅黑"/>
           <w:b/>
           <w:i w:val="0"/>
-          <w:color w:val="1F3964"/>
+          <w:color w:val="4E7EBA"/>
           <w:sz w:val="27"/>
         </w:rPr>
         <w:t>核心问题：文字 → 数字</w:t>
@@ -2178,7 +2178,7 @@
           <w:rFonts w:ascii="Times New Roman" w:hAnsi="Times New Roman" w:eastAsia="微软雅黑"/>
           <w:b/>
           <w:i w:val="0"/>
-          <w:color w:val="1F3964"/>
+          <w:color w:val="4E7EBA"/>
           <w:sz w:val="27"/>
         </w:rPr>
         <w:t>那怎么分呢？</w:t>
@@ -2327,7 +2327,7 @@
           <w:rFonts w:ascii="Times New Roman" w:hAnsi="Times New Roman" w:eastAsia="微软雅黑"/>
           <w:b/>
           <w:i w:val="0"/>
-          <w:color w:val="1F3964"/>
+          <w:color w:val="4E7EBA"/>
           <w:sz w:val="32"/>
         </w:rPr>
         <w:t>1.2 四种分词方案：逐个拆解</w:t>
@@ -2343,7 +2343,7 @@
           <w:rFonts w:ascii="Times New Roman" w:hAnsi="Times New Roman" w:eastAsia="微软雅黑"/>
           <w:b/>
           <w:i w:val="0"/>
-          <w:color w:val="1F3964"/>
+          <w:color w:val="4E7EBA"/>
           <w:sz w:val="27"/>
         </w:rPr>
         <w:t>方案一：字符级分词（Character-level）</w:t>
@@ -2588,7 +2588,7 @@
           <w:rFonts w:ascii="Times New Roman" w:hAnsi="Times New Roman" w:eastAsia="微软雅黑"/>
           <w:b/>
           <w:i w:val="0"/>
-          <w:color w:val="1F3964"/>
+          <w:color w:val="4E7EBA"/>
           <w:sz w:val="27"/>
         </w:rPr>
         <w:t>方案二：字节级分词（Byte-level）</w:t>
@@ -2994,7 +2994,7 @@
           <w:rFonts w:ascii="Times New Roman" w:hAnsi="Times New Roman" w:eastAsia="微软雅黑"/>
           <w:b/>
           <w:i w:val="0"/>
-          <w:color w:val="1F3964"/>
+          <w:color w:val="4E7EBA"/>
           <w:sz w:val="27"/>
         </w:rPr>
         <w:t>方案三：词级分词（Word-level）</w:t>
@@ -3272,7 +3272,7 @@
           <w:rFonts w:ascii="Times New Roman" w:hAnsi="Times New Roman" w:eastAsia="微软雅黑"/>
           <w:b/>
           <w:i w:val="0"/>
-          <w:color w:val="1F3964"/>
+          <w:color w:val="4E7EBA"/>
           <w:sz w:val="27"/>
         </w:rPr>
         <w:t>方案四：BPE（Byte Pair Encoding，字节对编码）</w:t>
@@ -3705,7 +3705,7 @@
           <w:rFonts w:ascii="Times New Roman" w:hAnsi="Times New Roman" w:eastAsia="微软雅黑"/>
           <w:b/>
           <w:i w:val="0"/>
-          <w:color w:val="1F3964"/>
+          <w:color w:val="4E7EBA"/>
           <w:sz w:val="27"/>
         </w:rPr>
         <w:t>四种方案对比总结</w:t>
@@ -4267,7 +4267,7 @@
           <w:rFonts w:ascii="Times New Roman" w:hAnsi="Times New Roman" w:eastAsia="微软雅黑"/>
           <w:b/>
           <w:i w:val="0"/>
-          <w:color w:val="1F3964"/>
+          <w:color w:val="4E7EBA"/>
           <w:sz w:val="32"/>
         </w:rPr>
         <w:t>1.3 BPE 算法：手把手教你算</w:t>
@@ -4315,7 +4315,7 @@
           <w:rFonts w:ascii="Times New Roman" w:hAnsi="Times New Roman" w:eastAsia="微软雅黑"/>
           <w:b/>
           <w:i w:val="0"/>
-          <w:color w:val="1F3964"/>
+          <w:color w:val="4E7EBA"/>
           <w:sz w:val="27"/>
         </w:rPr>
         <w:t>准备工作</w:t>
@@ -4376,7 +4376,7 @@
           <w:rFonts w:ascii="Times New Roman" w:hAnsi="Times New Roman" w:eastAsia="微软雅黑"/>
           <w:b/>
           <w:i w:val="0"/>
-          <w:color w:val="1F3964"/>
+          <w:color w:val="4E7EBA"/>
           <w:sz w:val="27"/>
         </w:rPr>
         <w:t>第一步：初始化</w:t>
@@ -4470,7 +4470,7 @@
           <w:rFonts w:ascii="Times New Roman" w:hAnsi="Times New Roman" w:eastAsia="微软雅黑"/>
           <w:b/>
           <w:i w:val="0"/>
-          <w:color w:val="1F3964"/>
+          <w:color w:val="4E7EBA"/>
           <w:sz w:val="27"/>
         </w:rPr>
         <w:t>第二步：第一次合并</w:t>
@@ -4820,7 +4820,7 @@
           <w:rFonts w:ascii="Times New Roman" w:hAnsi="Times New Roman" w:eastAsia="微软雅黑"/>
           <w:b/>
           <w:i w:val="0"/>
-          <w:color w:val="1F3964"/>
+          <w:color w:val="4E7EBA"/>
           <w:sz w:val="27"/>
         </w:rPr>
         <w:t>第三步：第二次合并</w:t>
@@ -5119,7 +5119,7 @@
           <w:rFonts w:ascii="Times New Roman" w:hAnsi="Times New Roman" w:eastAsia="微软雅黑"/>
           <w:b/>
           <w:i w:val="0"/>
-          <w:color w:val="1F3964"/>
+          <w:color w:val="4E7EBA"/>
           <w:sz w:val="27"/>
         </w:rPr>
         <w:t>第四步：继续合并……</w:t>
@@ -5149,7 +5149,7 @@
           <w:rFonts w:ascii="Times New Roman" w:hAnsi="Times New Roman" w:eastAsia="微软雅黑"/>
           <w:b/>
           <w:i w:val="0"/>
-          <w:color w:val="1F3964"/>
+          <w:color w:val="4E7EBA"/>
           <w:sz w:val="27"/>
         </w:rPr>
         <w:t>编码（Encode）：怎么用训练好的 BPE 分词？</w:t>
@@ -5348,7 +5348,7 @@
           <w:rFonts w:ascii="Times New Roman" w:hAnsi="Times New Roman" w:eastAsia="微软雅黑"/>
           <w:b/>
           <w:i w:val="0"/>
-          <w:color w:val="1F3964"/>
+          <w:color w:val="4E7EBA"/>
           <w:sz w:val="27"/>
         </w:rPr>
         <w:t>解码（Decode）：怎么把 token 还原成文字？</w:t>
@@ -5517,7 +5517,7 @@
           <w:rFonts w:ascii="Times New Roman" w:hAnsi="Times New Roman" w:eastAsia="微软雅黑"/>
           <w:b/>
           <w:i w:val="0"/>
-          <w:color w:val="1F3964"/>
+          <w:color w:val="4E7EBA"/>
           <w:sz w:val="32"/>
         </w:rPr>
         <w:t>1.4 压缩比：为什么分词很重要？</w:t>
@@ -5533,7 +5533,7 @@
           <w:rFonts w:ascii="Times New Roman" w:hAnsi="Times New Roman" w:eastAsia="微软雅黑"/>
           <w:b/>
           <w:i w:val="0"/>
-          <w:color w:val="1F3964"/>
+          <w:color w:val="4E7EBA"/>
           <w:sz w:val="27"/>
         </w:rPr>
         <w:t>什么是压缩比？</w:t>
@@ -5637,7 +5637,7 @@
           <w:rFonts w:ascii="Times New Roman" w:hAnsi="Times New Roman" w:eastAsia="微软雅黑"/>
           <w:b/>
           <w:i w:val="0"/>
-          <w:color w:val="1F3964"/>
+          <w:color w:val="4E7EBA"/>
           <w:sz w:val="27"/>
         </w:rPr>
         <w:t>为什么压缩比重要？</w:t>
@@ -5775,7 +5775,7 @@
           <w:rFonts w:ascii="Times New Roman" w:hAnsi="Times New Roman" w:eastAsia="微软雅黑"/>
           <w:b/>
           <w:i w:val="0"/>
-          <w:color w:val="1F3964"/>
+          <w:color w:val="4E7EBA"/>
           <w:sz w:val="27"/>
         </w:rPr>
         <w:t>但不是越大越好……</w:t>
@@ -5876,7 +5876,7 @@
           <w:rFonts w:ascii="Times New Roman" w:hAnsi="Times New Roman" w:eastAsia="微软雅黑"/>
           <w:b/>
           <w:i w:val="0"/>
-          <w:color w:val="1F3964"/>
+          <w:color w:val="4E7EBA"/>
           <w:sz w:val="32"/>
         </w:rPr>
         <w:t>1.5 实际 BPE 的那些"额外细节"</w:t>
@@ -5906,7 +5906,7 @@
           <w:rFonts w:ascii="Times New Roman" w:hAnsi="Times New Roman" w:eastAsia="微软雅黑"/>
           <w:b/>
           <w:i w:val="0"/>
-          <w:color w:val="1F3964"/>
+          <w:color w:val="4E7EBA"/>
           <w:sz w:val="27"/>
         </w:rPr>
         <w:t>1. 预分词（Pre-tokenization）</w:t>
@@ -6108,7 +6108,7 @@
           <w:rFonts w:ascii="Times New Roman" w:hAnsi="Times New Roman" w:eastAsia="微软雅黑"/>
           <w:b/>
           <w:i w:val="0"/>
-          <w:color w:val="1F3964"/>
+          <w:color w:val="4E7EBA"/>
           <w:sz w:val="27"/>
         </w:rPr>
         <w:t>2. 特殊 token（Special Tokens）</w:t>
@@ -6253,7 +6253,7 @@
           <w:rFonts w:ascii="Times New Roman" w:hAnsi="Times New Roman" w:eastAsia="微软雅黑"/>
           <w:b/>
           <w:i w:val="0"/>
-          <w:color w:val="1F3964"/>
+          <w:color w:val="4E7EBA"/>
           <w:sz w:val="27"/>
         </w:rPr>
         <w:t>3. 高效实现</w:t>
@@ -6333,7 +6333,7 @@
           <w:rFonts w:ascii="Times New Roman" w:hAnsi="Times New Roman" w:eastAsia="微软雅黑"/>
           <w:b/>
           <w:i w:val="0"/>
-          <w:color w:val="1F3964"/>
+          <w:color w:val="4E7EBA"/>
           <w:sz w:val="32"/>
         </w:rPr>
         <w:t>1.6 小白常见问题 Q&amp;A</w:t>
@@ -6349,7 +6349,7 @@
           <w:rFonts w:ascii="Times New Roman" w:hAnsi="Times New Roman" w:eastAsia="微软雅黑"/>
           <w:b/>
           <w:i w:val="0"/>
-          <w:color w:val="1F3964"/>
+          <w:color w:val="4E7EBA"/>
           <w:sz w:val="27"/>
         </w:rPr>
         <w:t>Q：为什么不用中文的"字"做 token？</w:t>
@@ -6451,7 +6451,7 @@
           <w:rFonts w:ascii="Times New Roman" w:hAnsi="Times New Roman" w:eastAsia="微软雅黑"/>
           <w:b/>
           <w:i w:val="0"/>
-          <w:color w:val="1F3964"/>
+          <w:color w:val="4E7EBA"/>
           <w:sz w:val="27"/>
         </w:rPr>
         <w:t>Q：BPE 和 WordPiece 有什么区别？</w:t>
@@ -6561,7 +6561,7 @@
           <w:rFonts w:ascii="Times New Roman" w:hAnsi="Times New Roman" w:eastAsia="微软雅黑"/>
           <w:b/>
           <w:i w:val="0"/>
-          <w:color w:val="1F3964"/>
+          <w:color w:val="4E7EBA"/>
           <w:sz w:val="27"/>
         </w:rPr>
         <w:t>Q：词表大小是怎么选的？</w:t>
@@ -6690,7 +6690,7 @@
           <w:rFonts w:ascii="Times New Roman" w:hAnsi="Times New Roman" w:eastAsia="微软雅黑"/>
           <w:b/>
           <w:i w:val="0"/>
-          <w:color w:val="1F3964"/>
+          <w:color w:val="4E7EBA"/>
           <w:sz w:val="27"/>
         </w:rPr>
         <w:t>Q：分词会影响模型效果吗？</w:t>
@@ -6815,7 +6815,7 @@
           <w:rFonts w:ascii="Times New Roman" w:hAnsi="Times New Roman" w:eastAsia="微软雅黑"/>
           <w:b/>
           <w:i w:val="0"/>
-          <w:color w:val="1F3964"/>
+          <w:color w:val="4E7EBA"/>
           <w:sz w:val="32"/>
         </w:rPr>
         <w:t>1.7 第一讲学习路线图</w:t>
@@ -6831,7 +6831,7 @@
           <w:rFonts w:ascii="Times New Roman" w:hAnsi="Times New Roman" w:eastAsia="微软雅黑"/>
           <w:b/>
           <w:i w:val="0"/>
-          <w:color w:val="1F3964"/>
+          <w:color w:val="4E7EBA"/>
           <w:sz w:val="27"/>
         </w:rPr>
         <w:t>你应该掌握到什么程度？</w:t>
@@ -7037,7 +7037,7 @@
           <w:rFonts w:ascii="Times New Roman" w:hAnsi="Times New Roman" w:eastAsia="微软雅黑"/>
           <w:b/>
           <w:i w:val="0"/>
-          <w:color w:val="1F3964"/>
+          <w:color w:val="4E7EBA"/>
           <w:sz w:val="27"/>
         </w:rPr>
         <w:t>怎么配合作业 1 学习？</w:t>
@@ -7219,7 +7219,7 @@
           <w:rFonts w:ascii="Times New Roman" w:hAnsi="Times New Roman" w:eastAsia="微软雅黑"/>
           <w:b/>
           <w:i w:val="0"/>
-          <w:color w:val="1F3964"/>
+          <w:color w:val="4E7EBA"/>
           <w:sz w:val="40"/>
         </w:rPr>
         <w:t>第二讲：资源核算 —— 训练大模型到底要花多少钱？</w:t>
@@ -7235,7 +7235,7 @@
           <w:rFonts w:ascii="Times New Roman" w:hAnsi="Times New Roman" w:eastAsia="微软雅黑"/>
           <w:b/>
           <w:i w:val="0"/>
-          <w:color w:val="1F3964"/>
+          <w:color w:val="4E7EBA"/>
           <w:sz w:val="32"/>
         </w:rPr>
         <w:t>2.0 前置知识：GPU 是怎么工作的？</w:t>
@@ -7251,7 +7251,7 @@
           <w:rFonts w:ascii="Times New Roman" w:hAnsi="Times New Roman" w:eastAsia="微软雅黑"/>
           <w:b/>
           <w:i w:val="0"/>
-          <w:color w:val="1F3964"/>
+          <w:color w:val="4E7EBA"/>
           <w:sz w:val="27"/>
         </w:rPr>
         <w:t>为什么深度学习用 GPU？</w:t>
@@ -7290,7 +7290,7 @@
           <w:rFonts w:ascii="Times New Roman" w:hAnsi="Times New Roman" w:eastAsia="微软雅黑"/>
           <w:b/>
           <w:i w:val="0"/>
-          <w:color w:val="1F3964"/>
+          <w:color w:val="4E7EBA"/>
           <w:sz w:val="24"/>
         </w:rPr>
         <w:t>CPU vs GPU：核心数量的差异</w:t>
@@ -7431,7 +7431,7 @@
           <w:rFonts w:ascii="Times New Roman" w:hAnsi="Times New Roman" w:eastAsia="微软雅黑"/>
           <w:b/>
           <w:i w:val="0"/>
-          <w:color w:val="1F3964"/>
+          <w:color w:val="4E7EBA"/>
           <w:sz w:val="27"/>
         </w:rPr>
         <w:t>GPU 的两个关键资源</w:t>
@@ -7623,7 +7623,7 @@
           <w:rFonts w:ascii="Times New Roman" w:hAnsi="Times New Roman" w:eastAsia="微软雅黑"/>
           <w:b/>
           <w:i w:val="0"/>
-          <w:color w:val="1F3964"/>
+          <w:color w:val="4E7EBA"/>
           <w:sz w:val="27"/>
         </w:rPr>
         <w:t>一个关键洞察</w:t>
@@ -7751,7 +7751,7 @@
           <w:rFonts w:ascii="Times New Roman" w:hAnsi="Times New Roman" w:eastAsia="微软雅黑"/>
           <w:b/>
           <w:i w:val="0"/>
-          <w:color w:val="1F3964"/>
+          <w:color w:val="4E7EBA"/>
           <w:sz w:val="32"/>
         </w:rPr>
         <w:t>2.1 张量：深度学习的基本单位</w:t>
@@ -7767,7 +7767,7 @@
           <w:rFonts w:ascii="Times New Roman" w:hAnsi="Times New Roman" w:eastAsia="微软雅黑"/>
           <w:b/>
           <w:i w:val="0"/>
-          <w:color w:val="1F3964"/>
+          <w:color w:val="4E7EBA"/>
           <w:sz w:val="27"/>
         </w:rPr>
         <w:t>什么是张量？</w:t>
@@ -8359,7 +8359,7 @@
           <w:rFonts w:ascii="Times New Roman" w:hAnsi="Times New Roman" w:eastAsia="微软雅黑"/>
           <w:b/>
           <w:i w:val="0"/>
-          <w:color w:val="1F3964"/>
+          <w:color w:val="4E7EBA"/>
           <w:sz w:val="27"/>
         </w:rPr>
         <w:t>Transformer 里的张量长什么样？</w:t>
@@ -9019,7 +9019,7 @@
           <w:rFonts w:ascii="Times New Roman" w:hAnsi="Times New Roman" w:eastAsia="微软雅黑"/>
           <w:b/>
           <w:i w:val="0"/>
-          <w:color w:val="1F3964"/>
+          <w:color w:val="4E7EBA"/>
           <w:sz w:val="32"/>
         </w:rPr>
         <w:t>2.2 数据类型：精度的那些事</w:t>
@@ -9035,7 +9035,7 @@
           <w:rFonts w:ascii="Times New Roman" w:hAnsi="Times New Roman" w:eastAsia="微软雅黑"/>
           <w:b/>
           <w:i w:val="0"/>
-          <w:color w:val="1F3964"/>
+          <w:color w:val="4E7EBA"/>
           <w:sz w:val="27"/>
         </w:rPr>
         <w:t>为什么有不同的精度？</w:t>
@@ -9579,7 +9579,7 @@
           <w:rFonts w:ascii="Times New Roman" w:hAnsi="Times New Roman" w:eastAsia="微软雅黑"/>
           <w:b/>
           <w:i w:val="0"/>
-          <w:color w:val="1F3964"/>
+          <w:color w:val="4E7EBA"/>
           <w:sz w:val="27"/>
         </w:rPr>
         <w:t>为什么 bf16 比 fp16 好？</w:t>
@@ -9815,7 +9815,7 @@
           <w:rFonts w:ascii="Times New Roman" w:hAnsi="Times New Roman" w:eastAsia="微软雅黑"/>
           <w:b/>
           <w:i w:val="0"/>
-          <w:color w:val="1F3964"/>
+          <w:color w:val="4E7EBA"/>
           <w:sz w:val="27"/>
         </w:rPr>
         <w:t>混合精度训练（Mixed Precision）</w:t>
@@ -9993,7 +9993,7 @@
           <w:rFonts w:ascii="Times New Roman" w:hAnsi="Times New Roman" w:eastAsia="微软雅黑"/>
           <w:b/>
           <w:i w:val="0"/>
-          <w:color w:val="1F3964"/>
+          <w:color w:val="4E7EBA"/>
           <w:sz w:val="32"/>
         </w:rPr>
         <w:t>2.3 einops：让张量操作不再头疼</w:t>
@@ -10009,7 +10009,7 @@
           <w:rFonts w:ascii="Times New Roman" w:hAnsi="Times New Roman" w:eastAsia="微软雅黑"/>
           <w:b/>
           <w:i w:val="0"/>
-          <w:color w:val="1F3964"/>
+          <w:color w:val="4E7EBA"/>
           <w:sz w:val="27"/>
         </w:rPr>
         <w:t>为什么传统写法容易出错？</w:t>
@@ -10136,7 +10136,7 @@
           <w:rFonts w:ascii="Times New Roman" w:hAnsi="Times New Roman" w:eastAsia="微软雅黑"/>
           <w:b/>
           <w:i w:val="0"/>
-          <w:color w:val="1F3964"/>
+          <w:color w:val="4E7EBA"/>
           <w:sz w:val="27"/>
         </w:rPr>
         <w:t>einops 的思路：用名字代替索引</w:t>
@@ -10207,7 +10207,7 @@
           <w:rFonts w:ascii="Times New Roman" w:hAnsi="Times New Roman" w:eastAsia="微软雅黑"/>
           <w:b/>
           <w:i w:val="0"/>
-          <w:color w:val="1F3964"/>
+          <w:color w:val="4E7EBA"/>
           <w:sz w:val="24"/>
         </w:rPr>
         <w:t>1. einsum：广义矩阵乘法</w:t>
@@ -10506,7 +10506,7 @@
           <w:rFonts w:ascii="Times New Roman" w:hAnsi="Times New Roman" w:eastAsia="微软雅黑"/>
           <w:b/>
           <w:i w:val="0"/>
-          <w:color w:val="1F3964"/>
+          <w:color w:val="4E7EBA"/>
           <w:sz w:val="24"/>
         </w:rPr>
         <w:t>2. reduce：归约操作（求和、求平均等）</w:t>
@@ -10799,7 +10799,7 @@
           <w:rFonts w:ascii="Times New Roman" w:hAnsi="Times New Roman" w:eastAsia="微软雅黑"/>
           <w:b/>
           <w:i w:val="0"/>
-          <w:color w:val="1F3964"/>
+          <w:color w:val="4E7EBA"/>
           <w:sz w:val="24"/>
         </w:rPr>
         <w:t>3. rearrange：重排维度（拆分、合并、交换）</w:t>
@@ -11031,7 +11031,7 @@
           <w:rFonts w:ascii="Times New Roman" w:hAnsi="Times New Roman" w:eastAsia="微软雅黑"/>
           <w:b/>
           <w:i w:val="0"/>
-          <w:color w:val="1F3964"/>
+          <w:color w:val="4E7EBA"/>
           <w:sz w:val="32"/>
         </w:rPr>
         <w:t>2.4 FLOPs：计算量怎么算？</w:t>
@@ -11047,7 +11047,7 @@
           <w:rFonts w:ascii="Times New Roman" w:hAnsi="Times New Roman" w:eastAsia="微软雅黑"/>
           <w:b/>
           <w:i w:val="0"/>
-          <w:color w:val="1F3964"/>
+          <w:color w:val="4E7EBA"/>
           <w:sz w:val="27"/>
         </w:rPr>
         <w:t>什么是 FLOP？</w:t>
@@ -11168,7 +11168,7 @@
           <w:rFonts w:ascii="Times New Roman" w:hAnsi="Times New Roman" w:eastAsia="微软雅黑"/>
           <w:b/>
           <w:i w:val="0"/>
-          <w:color w:val="1F3964"/>
+          <w:color w:val="4E7EBA"/>
           <w:sz w:val="27"/>
         </w:rPr>
         <w:t>矩阵乘法的 FLOPs 怎么算？</w:t>
@@ -11474,7 +11474,7 @@
           <w:rFonts w:ascii="Times New Roman" w:hAnsi="Times New Roman" w:eastAsia="微软雅黑"/>
           <w:b/>
           <w:i w:val="0"/>
-          <w:color w:val="1F3964"/>
+          <w:color w:val="4E7EBA"/>
           <w:sz w:val="27"/>
         </w:rPr>
         <w:t>训练一个 step 的 FLOPs</w:t>
@@ -11603,7 +11603,7 @@
           <w:rFonts w:ascii="Times New Roman" w:hAnsi="Times New Roman" w:eastAsia="微软雅黑"/>
           <w:b/>
           <w:i w:val="0"/>
-          <w:color w:val="1F3964"/>
+          <w:color w:val="4E7EBA"/>
           <w:sz w:val="24"/>
         </w:rPr>
         <w:t>前向传播的 FLOPs</w:t>
@@ -11681,7 +11681,7 @@
           <w:rFonts w:ascii="Times New Roman" w:hAnsi="Times New Roman" w:eastAsia="微软雅黑"/>
           <w:b/>
           <w:i w:val="0"/>
-          <w:color w:val="1F3964"/>
+          <w:color w:val="4E7EBA"/>
           <w:sz w:val="24"/>
         </w:rPr>
         <w:t>反向传播的 FLOPs</w:t>
@@ -11815,7 +11815,7 @@
           <w:rFonts w:ascii="Times New Roman" w:hAnsi="Times New Roman" w:eastAsia="微软雅黑"/>
           <w:b/>
           <w:i w:val="0"/>
-          <w:color w:val="1F3964"/>
+          <w:color w:val="4E7EBA"/>
           <w:sz w:val="24"/>
         </w:rPr>
         <w:t>合计</w:t>
@@ -11916,7 +11916,7 @@
           <w:rFonts w:ascii="Times New Roman" w:hAnsi="Times New Roman" w:eastAsia="微软雅黑"/>
           <w:b/>
           <w:i w:val="0"/>
-          <w:color w:val="1F3964"/>
+          <w:color w:val="4E7EBA"/>
           <w:sz w:val="27"/>
         </w:rPr>
         <w:t>MFU：模型浮点利用率</w:t>
@@ -12153,7 +12153,7 @@
           <w:rFonts w:ascii="Times New Roman" w:hAnsi="Times New Roman" w:eastAsia="微软雅黑"/>
           <w:b/>
           <w:i w:val="0"/>
-          <w:color w:val="1F3964"/>
+          <w:color w:val="4E7EBA"/>
           <w:sz w:val="32"/>
         </w:rPr>
         <w:t>2.5 算术强度：这才是性能的核心</w:t>
@@ -12183,7 +12183,7 @@
           <w:rFonts w:ascii="Times New Roman" w:hAnsi="Times New Roman" w:eastAsia="微软雅黑"/>
           <w:b/>
           <w:i w:val="0"/>
-          <w:color w:val="1F3964"/>
+          <w:color w:val="4E7EBA"/>
           <w:sz w:val="27"/>
         </w:rPr>
         <w:t>用"工厂流水线"来理解</w:t>
@@ -12505,7 +12505,7 @@
           <w:rFonts w:ascii="Times New Roman" w:hAnsi="Times New Roman" w:eastAsia="微软雅黑"/>
           <w:b/>
           <w:i w:val="0"/>
-          <w:color w:val="1F3964"/>
+          <w:color w:val="4E7EBA"/>
           <w:sz w:val="27"/>
         </w:rPr>
         <w:t>两个关键指标</w:t>
@@ -12521,7 +12521,7 @@
           <w:rFonts w:ascii="Times New Roman" w:hAnsi="Times New Roman" w:eastAsia="微软雅黑"/>
           <w:b/>
           <w:i w:val="0"/>
-          <w:color w:val="1F3964"/>
+          <w:color w:val="4E7EBA"/>
           <w:sz w:val="24"/>
         </w:rPr>
         <w:t>1. 加速器强度（Accelerator Intensity）</w:t>
@@ -12647,7 +12647,7 @@
           <w:rFonts w:ascii="Times New Roman" w:hAnsi="Times New Roman" w:eastAsia="微软雅黑"/>
           <w:b/>
           <w:i w:val="0"/>
-          <w:color w:val="1F3964"/>
+          <w:color w:val="4E7EBA"/>
           <w:sz w:val="24"/>
         </w:rPr>
         <w:t>2. 算术强度（Arithmetic Intensity）</w:t>
@@ -12791,7 +12791,7 @@
           <w:rFonts w:ascii="Times New Roman" w:hAnsi="Times New Roman" w:eastAsia="微软雅黑"/>
           <w:b/>
           <w:i w:val="0"/>
-          <w:color w:val="1F3964"/>
+          <w:color w:val="4E7EBA"/>
           <w:sz w:val="27"/>
         </w:rPr>
         <w:t>怎么判断瓶颈？</w:t>
@@ -13119,7 +13119,7 @@
           <w:rFonts w:ascii="Times New Roman" w:hAnsi="Times New Roman" w:eastAsia="微软雅黑"/>
           <w:b/>
           <w:i w:val="0"/>
-          <w:color w:val="1F3964"/>
+          <w:color w:val="4E7EBA"/>
           <w:sz w:val="27"/>
         </w:rPr>
         <w:t>Roofline 模型：一张图看懂</w:t>
@@ -13466,7 +13466,7 @@
           <w:rFonts w:ascii="Times New Roman" w:hAnsi="Times New Roman" w:eastAsia="微软雅黑"/>
           <w:b/>
           <w:i w:val="0"/>
-          <w:color w:val="1F3964"/>
+          <w:color w:val="4E7EBA"/>
           <w:sz w:val="27"/>
         </w:rPr>
         <w:t>常见操作的算术强度</w:t>
@@ -14087,7 +14087,7 @@
           <w:rFonts w:ascii="Times New Roman" w:hAnsi="Times New Roman" w:eastAsia="微软雅黑"/>
           <w:b/>
           <w:i w:val="0"/>
-          <w:color w:val="1F3964"/>
+          <w:color w:val="4E7EBA"/>
           <w:sz w:val="27"/>
         </w:rPr>
         <w:t>为什么推理比训练难优化？</w:t>
@@ -14117,7 +14117,7 @@
           <w:rFonts w:ascii="Times New Roman" w:hAnsi="Times New Roman" w:eastAsia="微软雅黑"/>
           <w:b/>
           <w:i w:val="0"/>
-          <w:color w:val="1F3964"/>
+          <w:color w:val="4E7EBA"/>
           <w:sz w:val="24"/>
         </w:rPr>
         <w:t>训练时</w:t>
@@ -14181,7 +14181,7 @@
           <w:rFonts w:ascii="Times New Roman" w:hAnsi="Times New Roman" w:eastAsia="微软雅黑"/>
           <w:b/>
           <w:i w:val="0"/>
-          <w:color w:val="1F3964"/>
+          <w:color w:val="4E7EBA"/>
           <w:sz w:val="24"/>
         </w:rPr>
         <w:t>推理时（生成文本时）</w:t>
@@ -14353,7 +14353,7 @@
           <w:rFonts w:ascii="Times New Roman" w:hAnsi="Times New Roman" w:eastAsia="微软雅黑"/>
           <w:b/>
           <w:i w:val="0"/>
-          <w:color w:val="1F3964"/>
+          <w:color w:val="4E7EBA"/>
           <w:sz w:val="32"/>
         </w:rPr>
         <w:t>2.6 训练资源核算：实际算一算</w:t>
@@ -14383,7 +14383,7 @@
           <w:rFonts w:ascii="Times New Roman" w:hAnsi="Times New Roman" w:eastAsia="微软雅黑"/>
           <w:b/>
           <w:i w:val="0"/>
-          <w:color w:val="1F3964"/>
+          <w:color w:val="4E7EBA"/>
           <w:sz w:val="27"/>
         </w:rPr>
         <w:t>显存里都存了什么？</w:t>
@@ -14863,7 +14863,7 @@
           <w:rFonts w:ascii="Times New Roman" w:hAnsi="Times New Roman" w:eastAsia="微软雅黑"/>
           <w:b/>
           <w:i w:val="0"/>
-          <w:color w:val="1F3964"/>
+          <w:color w:val="4E7EBA"/>
           <w:sz w:val="27"/>
         </w:rPr>
         <w:t>例子：8 张 H100 能训多大的模型？</w:t>
@@ -15146,7 +15146,7 @@
           <w:rFonts w:ascii="Times New Roman" w:hAnsi="Times New Roman" w:eastAsia="微软雅黑"/>
           <w:b/>
           <w:i w:val="0"/>
-          <w:color w:val="1F3964"/>
+          <w:color w:val="4E7EBA"/>
           <w:sz w:val="27"/>
         </w:rPr>
         <w:t>训练时间怎么估算？</w:t>
@@ -15485,7 +15485,7 @@
           <w:rFonts w:ascii="Times New Roman" w:hAnsi="Times New Roman" w:eastAsia="微软雅黑"/>
           <w:b/>
           <w:i w:val="0"/>
-          <w:color w:val="1F3964"/>
+          <w:color w:val="4E7EBA"/>
           <w:sz w:val="32"/>
         </w:rPr>
         <w:t>2.7 内存不够怎么办？</w:t>
@@ -15515,7 +15515,7 @@
           <w:rFonts w:ascii="Times New Roman" w:hAnsi="Times New Roman" w:eastAsia="微软雅黑"/>
           <w:b/>
           <w:i w:val="0"/>
-          <w:color w:val="1F3964"/>
+          <w:color w:val="4E7EBA"/>
           <w:sz w:val="27"/>
         </w:rPr>
         <w:t>方法一：梯度累积（Gradient Accumulation）</w:t>
@@ -15828,7 +15828,7 @@
           <w:rFonts w:ascii="Times New Roman" w:hAnsi="Times New Roman" w:eastAsia="微软雅黑"/>
           <w:b/>
           <w:i w:val="0"/>
-          <w:color w:val="1F3964"/>
+          <w:color w:val="4E7EBA"/>
           <w:sz w:val="27"/>
         </w:rPr>
         <w:t>方法二：激活检查点（Activation Checkpointing）</w:t>
@@ -16115,7 +16115,7 @@
           <w:rFonts w:ascii="Times New Roman" w:hAnsi="Times New Roman" w:eastAsia="微软雅黑"/>
           <w:b/>
           <w:i w:val="0"/>
-          <w:color w:val="1F3964"/>
+          <w:color w:val="4E7EBA"/>
           <w:sz w:val="32"/>
         </w:rPr>
         <w:t>2.8 小白常见问题 Q&amp;A</w:t>
@@ -16131,7 +16131,7 @@
           <w:rFonts w:ascii="Times New Roman" w:hAnsi="Times New Roman" w:eastAsia="微软雅黑"/>
           <w:b/>
           <w:i w:val="0"/>
-          <w:color w:val="1F3964"/>
+          <w:color w:val="4E7EBA"/>
           <w:sz w:val="27"/>
         </w:rPr>
         <w:t>Q：FLOPs 越少速度越快吗？</w:t>
@@ -16302,7 +16302,7 @@
           <w:rFonts w:ascii="Times New Roman" w:hAnsi="Times New Roman" w:eastAsia="微软雅黑"/>
           <w:b/>
           <w:i w:val="0"/>
-          <w:color w:val="1F3964"/>
+          <w:color w:val="4E7EBA"/>
           <w:sz w:val="27"/>
         </w:rPr>
         <w:t>Q：为什么 ReLU 和 GELU 速度差不多？</w:t>
@@ -16378,7 +16378,7 @@
           <w:rFonts w:ascii="Times New Roman" w:hAnsi="Times New Roman" w:eastAsia="微软雅黑"/>
           <w:b/>
           <w:i w:val="0"/>
-          <w:color w:val="1F3964"/>
+          <w:color w:val="4E7EBA"/>
           <w:sz w:val="27"/>
         </w:rPr>
         <w:t>Q：MFU 为什么达不到 100%？</w:t>
@@ -16554,7 +16554,7 @@
           <w:rFonts w:ascii="Times New Roman" w:hAnsi="Times New Roman" w:eastAsia="微软雅黑"/>
           <w:b/>
           <w:i w:val="0"/>
-          <w:color w:val="1F3964"/>
+          <w:color w:val="4E7EBA"/>
           <w:sz w:val="27"/>
         </w:rPr>
         <w:t>Q：为什么不直接用 fp32 训练？又稳又准？</w:t>
@@ -16646,7 +16646,7 @@
           <w:rFonts w:ascii="Times New Roman" w:hAnsi="Times New Roman" w:eastAsia="微软雅黑"/>
           <w:b/>
           <w:i w:val="0"/>
-          <w:color w:val="1F3964"/>
+          <w:color w:val="4E7EBA"/>
           <w:sz w:val="27"/>
         </w:rPr>
         <w:t>Q：梯度累积会不会影响训练效果？</w:t>
@@ -16708,7 +16708,7 @@
           <w:rFonts w:ascii="Times New Roman" w:hAnsi="Times New Roman" w:eastAsia="微软雅黑"/>
           <w:b/>
           <w:i w:val="0"/>
-          <w:color w:val="1F3964"/>
+          <w:color w:val="4E7EBA"/>
           <w:sz w:val="32"/>
         </w:rPr>
         <w:t>2.9 第二讲学习路线图</w:t>
@@ -16724,7 +16724,7 @@
           <w:rFonts w:ascii="Times New Roman" w:hAnsi="Times New Roman" w:eastAsia="微软雅黑"/>
           <w:b/>
           <w:i w:val="0"/>
-          <w:color w:val="1F3964"/>
+          <w:color w:val="4E7EBA"/>
           <w:sz w:val="27"/>
         </w:rPr>
         <w:t>你应该掌握到什么程度？</w:t>
@@ -17022,7 +17022,7 @@
           <w:rFonts w:ascii="Times New Roman" w:hAnsi="Times New Roman" w:eastAsia="微软雅黑"/>
           <w:b/>
           <w:i w:val="0"/>
-          <w:color w:val="1F3964"/>
+          <w:color w:val="4E7EBA"/>
           <w:sz w:val="27"/>
         </w:rPr>
         <w:t>怎么配合作业 1 学习？</w:t>
@@ -17160,7 +17160,7 @@
           <w:rFonts w:ascii="Times New Roman" w:hAnsi="Times New Roman" w:eastAsia="微软雅黑"/>
           <w:b/>
           <w:i w:val="0"/>
-          <w:color w:val="1F3964"/>
+          <w:color w:val="4E7EBA"/>
           <w:sz w:val="40"/>
         </w:rPr>
         <w:t>第三讲：Transformer 架构 —— 大模型的骨架长什么样？</w:t>
@@ -17176,7 +17176,7 @@
           <w:rFonts w:ascii="Times New Roman" w:hAnsi="Times New Roman" w:eastAsia="微软雅黑"/>
           <w:b/>
           <w:i w:val="0"/>
-          <w:color w:val="1F3964"/>
+          <w:color w:val="4E7EBA"/>
           <w:sz w:val="32"/>
         </w:rPr>
         <w:t>3.0 前置知识：神经网络基础</w:t>
@@ -17206,7 +17206,7 @@
           <w:rFonts w:ascii="Times New Roman" w:hAnsi="Times New Roman" w:eastAsia="微软雅黑"/>
           <w:b/>
           <w:i w:val="0"/>
-          <w:color w:val="1F3964"/>
+          <w:color w:val="4E7EBA"/>
           <w:sz w:val="27"/>
         </w:rPr>
         <w:t>什么是神经网络？</w:t>
@@ -17383,7 +17383,7 @@
           <w:rFonts w:ascii="Times New Roman" w:hAnsi="Times New Roman" w:eastAsia="微软雅黑"/>
           <w:b/>
           <w:i w:val="0"/>
-          <w:color w:val="1F3964"/>
+          <w:color w:val="4E7EBA"/>
           <w:sz w:val="27"/>
         </w:rPr>
         <w:t>什么是前向传播和反向传播？</w:t>
@@ -17534,7 +17534,7 @@
           <w:rFonts w:ascii="Times New Roman" w:hAnsi="Times New Roman" w:eastAsia="微软雅黑"/>
           <w:b/>
           <w:i w:val="0"/>
-          <w:color w:val="1F3964"/>
+          <w:color w:val="4E7EBA"/>
           <w:sz w:val="27"/>
         </w:rPr>
         <w:t>什么是残差连接（Residual Connection）？</w:t>
@@ -17738,7 +17738,7 @@
           <w:rFonts w:ascii="Times New Roman" w:hAnsi="Times New Roman" w:eastAsia="微软雅黑"/>
           <w:b/>
           <w:i w:val="0"/>
-          <w:color w:val="1F3964"/>
+          <w:color w:val="4E7EBA"/>
           <w:sz w:val="32"/>
         </w:rPr>
         <w:t>3.1 Transformer 整体结构：先看全貌</w:t>
@@ -17754,7 +17754,7 @@
           <w:rFonts w:ascii="Times New Roman" w:hAnsi="Times New Roman" w:eastAsia="微软雅黑"/>
           <w:b/>
           <w:i w:val="0"/>
-          <w:color w:val="1F3964"/>
+          <w:color w:val="4E7EBA"/>
           <w:sz w:val="27"/>
         </w:rPr>
         <w:t>一句话总结</w:t>
@@ -17944,7 +17944,7 @@
           <w:rFonts w:ascii="Times New Roman" w:hAnsi="Times New Roman" w:eastAsia="微软雅黑"/>
           <w:b/>
           <w:i w:val="0"/>
-          <w:color w:val="1F3964"/>
+          <w:color w:val="4E7EBA"/>
           <w:sz w:val="27"/>
         </w:rPr>
         <w:t>一层 Transformer Block 长什么样？</w:t>
@@ -18267,7 +18267,7 @@
           <w:rFonts w:ascii="Times New Roman" w:hAnsi="Times New Roman" w:eastAsia="微软雅黑"/>
           <w:b/>
           <w:i w:val="0"/>
-          <w:color w:val="1F3964"/>
+          <w:color w:val="4E7EBA"/>
           <w:sz w:val="27"/>
         </w:rPr>
         <w:t>数据是怎么流动的？</w:t>
@@ -18543,7 +18543,7 @@
           <w:rFonts w:ascii="Times New Roman" w:hAnsi="Times New Roman" w:eastAsia="微软雅黑"/>
           <w:b/>
           <w:i w:val="0"/>
-          <w:color w:val="1F3964"/>
+          <w:color w:val="4E7EBA"/>
           <w:sz w:val="32"/>
         </w:rPr>
         <w:t>3.2 归一化（Norm）：让训练稳定的秘诀</w:t>
@@ -18559,7 +18559,7 @@
           <w:rFonts w:ascii="Times New Roman" w:hAnsi="Times New Roman" w:eastAsia="微软雅黑"/>
           <w:b/>
           <w:i w:val="0"/>
-          <w:color w:val="1F3964"/>
+          <w:color w:val="4E7EBA"/>
           <w:sz w:val="27"/>
         </w:rPr>
         <w:t>为什么需要归一化？</w:t>
@@ -18720,7 +18720,7 @@
           <w:rFonts w:ascii="Times New Roman" w:hAnsi="Times New Roman" w:eastAsia="微软雅黑"/>
           <w:b/>
           <w:i w:val="0"/>
-          <w:color w:val="1F3964"/>
+          <w:color w:val="4E7EBA"/>
           <w:sz w:val="27"/>
         </w:rPr>
         <w:t>Pre-norm vs Post-norm：放哪里很重要</w:t>
@@ -18750,7 +18750,7 @@
           <w:rFonts w:ascii="Times New Roman" w:hAnsi="Times New Roman" w:eastAsia="微软雅黑"/>
           <w:b/>
           <w:i w:val="0"/>
-          <w:color w:val="1F3964"/>
+          <w:color w:val="4E7EBA"/>
           <w:sz w:val="24"/>
         </w:rPr>
         <w:t>Post-norm（原始 Transformer）</w:t>
@@ -18815,7 +18815,7 @@
           <w:rFonts w:ascii="Times New Roman" w:hAnsi="Times New Roman" w:eastAsia="微软雅黑"/>
           <w:b/>
           <w:i w:val="0"/>
-          <w:color w:val="1F3964"/>
+          <w:color w:val="4E7EBA"/>
           <w:sz w:val="24"/>
         </w:rPr>
         <w:t>Pre-norm（现代标准）</w:t>
@@ -18880,7 +18880,7 @@
           <w:rFonts w:ascii="Times New Roman" w:hAnsi="Times New Roman" w:eastAsia="微软雅黑"/>
           <w:b/>
           <w:i w:val="0"/>
-          <w:color w:val="1F3964"/>
+          <w:color w:val="4E7EBA"/>
           <w:sz w:val="24"/>
         </w:rPr>
         <w:t>为什么 Pre-norm 更好？</w:t>
@@ -19118,7 +19118,7 @@
           <w:rFonts w:ascii="Times New Roman" w:hAnsi="Times New Roman" w:eastAsia="微软雅黑"/>
           <w:b/>
           <w:i w:val="0"/>
-          <w:color w:val="1F3964"/>
+          <w:color w:val="4E7EBA"/>
           <w:sz w:val="24"/>
         </w:rPr>
         <w:t>新趋势：Double Norm / Non-residual Postnorm</w:t>
@@ -19228,7 +19228,7 @@
           <w:rFonts w:ascii="Times New Roman" w:hAnsi="Times New Roman" w:eastAsia="微软雅黑"/>
           <w:b/>
           <w:i w:val="0"/>
-          <w:color w:val="1F3964"/>
+          <w:color w:val="4E7EBA"/>
           <w:sz w:val="27"/>
         </w:rPr>
         <w:t>LayerNorm vs RMSNorm：简化也能行</w:t>
@@ -19244,7 +19244,7 @@
           <w:rFonts w:ascii="Times New Roman" w:hAnsi="Times New Roman" w:eastAsia="微软雅黑"/>
           <w:b/>
           <w:i w:val="0"/>
-          <w:color w:val="1F3964"/>
+          <w:color w:val="4E7EBA"/>
           <w:sz w:val="24"/>
         </w:rPr>
         <w:t>LayerNorm（层归一化）</w:t>
@@ -19387,7 +19387,7 @@
           <w:rFonts w:ascii="Times New Roman" w:hAnsi="Times New Roman" w:eastAsia="微软雅黑"/>
           <w:b/>
           <w:i w:val="0"/>
-          <w:color w:val="1F3964"/>
+          <w:color w:val="4E7EBA"/>
           <w:sz w:val="24"/>
         </w:rPr>
         <w:t>RMSNorm（均方根归一化）</w:t>
@@ -19601,7 +19601,7 @@
           <w:rFonts w:ascii="Times New Roman" w:hAnsi="Times New Roman" w:eastAsia="微软雅黑"/>
           <w:b/>
           <w:i w:val="0"/>
-          <w:color w:val="1F3964"/>
+          <w:color w:val="4E7EBA"/>
           <w:sz w:val="24"/>
         </w:rPr>
         <w:t>为什么 RMSNorm 更好？</w:t>
@@ -19889,7 +19889,7 @@
           <w:rFonts w:ascii="Times New Roman" w:hAnsi="Times New Roman" w:eastAsia="微软雅黑"/>
           <w:b/>
           <w:i w:val="0"/>
-          <w:color w:val="1F3964"/>
+          <w:color w:val="4E7EBA"/>
           <w:sz w:val="24"/>
         </w:rPr>
         <w:t>一个重要的洞察：FLOPs 不是一切</w:t>
@@ -20019,7 +20019,7 @@
           <w:rFonts w:ascii="Times New Roman" w:hAnsi="Times New Roman" w:eastAsia="微软雅黑"/>
           <w:b/>
           <w:i w:val="0"/>
-          <w:color w:val="1F3964"/>
+          <w:color w:val="4E7EBA"/>
           <w:sz w:val="27"/>
         </w:rPr>
         <w:t>去掉偏置项（Bias Terms）</w:t>
@@ -20216,7 +20216,7 @@
           <w:rFonts w:ascii="Times New Roman" w:hAnsi="Times New Roman" w:eastAsia="微软雅黑"/>
           <w:b/>
           <w:i w:val="0"/>
-          <w:color w:val="1F3964"/>
+          <w:color w:val="4E7EBA"/>
           <w:sz w:val="27"/>
         </w:rPr>
         <w:t>归一化总结</w:t>
@@ -20489,7 +20489,7 @@
           <w:rFonts w:ascii="Times New Roman" w:hAnsi="Times New Roman" w:eastAsia="微软雅黑"/>
           <w:b/>
           <w:i w:val="0"/>
-          <w:color w:val="1F3964"/>
+          <w:color w:val="4E7EBA"/>
           <w:sz w:val="32"/>
         </w:rPr>
         <w:t>3.3 激活函数与 FFN：神经网络的"灵魂"</w:t>
@@ -20505,7 +20505,7 @@
           <w:rFonts w:ascii="Times New Roman" w:hAnsi="Times New Roman" w:eastAsia="微软雅黑"/>
           <w:b/>
           <w:i w:val="0"/>
-          <w:color w:val="1F3964"/>
+          <w:color w:val="4E7EBA"/>
           <w:sz w:val="27"/>
         </w:rPr>
         <w:t>为什么需要激活函数？</w:t>
@@ -20681,7 +20681,7 @@
           <w:rFonts w:ascii="Times New Roman" w:hAnsi="Times New Roman" w:eastAsia="微软雅黑"/>
           <w:b/>
           <w:i w:val="0"/>
-          <w:color w:val="1F3964"/>
+          <w:color w:val="4E7EBA"/>
           <w:sz w:val="27"/>
         </w:rPr>
         <w:t>常见的激活函数</w:t>
@@ -20697,7 +20697,7 @@
           <w:rFonts w:ascii="Times New Roman" w:hAnsi="Times New Roman" w:eastAsia="微软雅黑"/>
           <w:b/>
           <w:i w:val="0"/>
-          <w:color w:val="1F3964"/>
+          <w:color w:val="4E7EBA"/>
           <w:sz w:val="24"/>
         </w:rPr>
         <w:t>ReLU（Rectified Linear Unit）</w:t>
@@ -20802,7 +20802,7 @@
           <w:rFonts w:ascii="Times New Roman" w:hAnsi="Times New Roman" w:eastAsia="微软雅黑"/>
           <w:b/>
           <w:i w:val="0"/>
-          <w:color w:val="1F3964"/>
+          <w:color w:val="4E7EBA"/>
           <w:sz w:val="24"/>
         </w:rPr>
         <w:t>GELU（Gaussian Error Linear Unit）</w:t>
@@ -20883,7 +20883,7 @@
           <w:rFonts w:ascii="Times New Roman" w:hAnsi="Times New Roman" w:eastAsia="微软雅黑"/>
           <w:b/>
           <w:i w:val="0"/>
-          <w:color w:val="1F3964"/>
+          <w:color w:val="4E7EBA"/>
           <w:sz w:val="24"/>
         </w:rPr>
         <w:t>SwiGLU / GeGLU（门控线性单元）</w:t>
@@ -20913,7 +20913,7 @@
           <w:rFonts w:ascii="Times New Roman" w:hAnsi="Times New Roman" w:eastAsia="微软雅黑"/>
           <w:b/>
           <w:i w:val="0"/>
-          <w:color w:val="1F3964"/>
+          <w:color w:val="4E7EBA"/>
           <w:sz w:val="27"/>
         </w:rPr>
         <w:t>门控线性单元（GLU 变体）</w:t>
@@ -20929,7 +20929,7 @@
           <w:rFonts w:ascii="Times New Roman" w:hAnsi="Times New Roman" w:eastAsia="微软雅黑"/>
           <w:b/>
           <w:i w:val="0"/>
-          <w:color w:val="1F3964"/>
+          <w:color w:val="4E7EBA"/>
           <w:sz w:val="24"/>
         </w:rPr>
         <w:t>普通 FFN 长什么样？</w:t>
@@ -21021,7 +21021,7 @@
           <w:rFonts w:ascii="Times New Roman" w:hAnsi="Times New Roman" w:eastAsia="微软雅黑"/>
           <w:b/>
           <w:i w:val="0"/>
-          <w:color w:val="1F3964"/>
+          <w:color w:val="4E7EBA"/>
           <w:sz w:val="24"/>
         </w:rPr>
         <w:t>门控 FFN 长什么样？</w:t>
@@ -21256,7 +21256,7 @@
           <w:rFonts w:ascii="Times New Roman" w:hAnsi="Times New Roman" w:eastAsia="微软雅黑"/>
           <w:b/>
           <w:i w:val="0"/>
-          <w:color w:val="1F3964"/>
+          <w:color w:val="4E7EBA"/>
           <w:sz w:val="24"/>
         </w:rPr>
         <w:t>常见的 GLU 变体</w:t>
@@ -21543,7 +21543,7 @@
           <w:rFonts w:ascii="Times New Roman" w:hAnsi="Times New Roman" w:eastAsia="微软雅黑"/>
           <w:b/>
           <w:i w:val="0"/>
-          <w:color w:val="1F3964"/>
+          <w:color w:val="4E7EBA"/>
           <w:sz w:val="24"/>
         </w:rPr>
         <w:t>注意：GLU 的 ff_dim 要小一点</w:t>
@@ -21639,7 +21639,7 @@
           <w:rFonts w:ascii="Times New Roman" w:hAnsi="Times New Roman" w:eastAsia="微软雅黑"/>
           <w:b/>
           <w:i w:val="0"/>
-          <w:color w:val="1F3964"/>
+          <w:color w:val="4E7EBA"/>
           <w:sz w:val="27"/>
         </w:rPr>
         <w:t>GLU 有效吗？</w:t>
@@ -21815,7 +21815,7 @@
           <w:rFonts w:ascii="Times New Roman" w:hAnsi="Times New Roman" w:eastAsia="微软雅黑"/>
           <w:b/>
           <w:i w:val="0"/>
-          <w:color w:val="1F3964"/>
+          <w:color w:val="4E7EBA"/>
           <w:sz w:val="27"/>
         </w:rPr>
         <w:t>串行 vs 并行层</w:t>
@@ -21831,7 +21831,7 @@
           <w:rFonts w:ascii="Times New Roman" w:hAnsi="Times New Roman" w:eastAsia="微软雅黑"/>
           <w:b/>
           <w:i w:val="0"/>
-          <w:color w:val="1F3964"/>
+          <w:color w:val="4E7EBA"/>
           <w:sz w:val="24"/>
         </w:rPr>
         <w:t>串行（标准做法）</w:t>
@@ -21891,7 +21891,7 @@
           <w:rFonts w:ascii="Times New Roman" w:hAnsi="Times New Roman" w:eastAsia="微软雅黑"/>
           <w:b/>
           <w:i w:val="0"/>
-          <w:color w:val="1F3964"/>
+          <w:color w:val="4E7EBA"/>
           <w:sz w:val="24"/>
         </w:rPr>
         <w:t>并行</w:t>
@@ -22046,7 +22046,7 @@
           <w:rFonts w:ascii="Times New Roman" w:hAnsi="Times New Roman" w:eastAsia="微软雅黑"/>
           <w:b/>
           <w:i w:val="0"/>
-          <w:color w:val="1F3964"/>
+          <w:color w:val="4E7EBA"/>
           <w:sz w:val="32"/>
         </w:rPr>
         <w:t>3.4 位置编码：模型怎么知道"第几个词"？</w:t>
@@ -22062,7 +22062,7 @@
           <w:rFonts w:ascii="Times New Roman" w:hAnsi="Times New Roman" w:eastAsia="微软雅黑"/>
           <w:b/>
           <w:i w:val="0"/>
-          <w:color w:val="1F3964"/>
+          <w:color w:val="4E7EBA"/>
           <w:sz w:val="27"/>
         </w:rPr>
         <w:t>为什么需要位置信息？</w:t>
@@ -22206,7 +22206,7 @@
           <w:rFonts w:ascii="Times New Roman" w:hAnsi="Times New Roman" w:eastAsia="微软雅黑"/>
           <w:b/>
           <w:i w:val="0"/>
-          <w:color w:val="1F3964"/>
+          <w:color w:val="4E7EBA"/>
           <w:sz w:val="27"/>
         </w:rPr>
         <w:t>四种位置编码方案</w:t>
@@ -22222,7 +22222,7 @@
           <w:rFonts w:ascii="Times New Roman" w:hAnsi="Times New Roman" w:eastAsia="微软雅黑"/>
           <w:b/>
           <w:i w:val="0"/>
-          <w:color w:val="1F3964"/>
+          <w:color w:val="4E7EBA"/>
           <w:sz w:val="24"/>
         </w:rPr>
         <w:t>1. Sinusoidal（正弦余弦位置编码）</w:t>
@@ -22337,7 +22337,7 @@
           <w:rFonts w:ascii="Times New Roman" w:hAnsi="Times New Roman" w:eastAsia="微软雅黑"/>
           <w:b/>
           <w:i w:val="0"/>
-          <w:color w:val="1F3964"/>
+          <w:color w:val="4E7EBA"/>
           <w:sz w:val="24"/>
         </w:rPr>
         <w:t>2. Absolute（绝对位置编码）</w:t>
@@ -22452,7 +22452,7 @@
           <w:rFonts w:ascii="Times New Roman" w:hAnsi="Times New Roman" w:eastAsia="微软雅黑"/>
           <w:b/>
           <w:i w:val="0"/>
-          <w:color w:val="1F3964"/>
+          <w:color w:val="4E7EBA"/>
           <w:sz w:val="24"/>
         </w:rPr>
         <w:t>3. Relative（相对位置编码）</w:t>
@@ -22567,7 +22567,7 @@
           <w:rFonts w:ascii="Times New Roman" w:hAnsi="Times New Roman" w:eastAsia="微软雅黑"/>
           <w:b/>
           <w:i w:val="0"/>
-          <w:color w:val="1F3964"/>
+          <w:color w:val="4E7EBA"/>
           <w:sz w:val="24"/>
         </w:rPr>
         <w:t>4. RoPE（旋转位置编码）</w:t>
@@ -22682,7 +22682,7 @@
           <w:rFonts w:ascii="Times New Roman" w:hAnsi="Times New Roman" w:eastAsia="微软雅黑"/>
           <w:b/>
           <w:i w:val="0"/>
-          <w:color w:val="1F3964"/>
+          <w:color w:val="4E7EBA"/>
           <w:sz w:val="27"/>
         </w:rPr>
         <w:t>RoPE 详解：用旋转来编码位置</w:t>
@@ -22712,7 +22712,7 @@
           <w:rFonts w:ascii="Times New Roman" w:hAnsi="Times New Roman" w:eastAsia="微软雅黑"/>
           <w:b/>
           <w:i w:val="0"/>
-          <w:color w:val="1F3964"/>
+          <w:color w:val="4E7EBA"/>
           <w:sz w:val="24"/>
         </w:rPr>
         <w:t>核心思想</w:t>
@@ -22830,7 +22830,7 @@
           <w:rFonts w:ascii="Times New Roman" w:hAnsi="Times New Roman" w:eastAsia="微软雅黑"/>
           <w:b/>
           <w:i w:val="0"/>
-          <w:color w:val="1F3964"/>
+          <w:color w:val="4E7EBA"/>
           <w:sz w:val="24"/>
         </w:rPr>
         <w:t>怎么实现？用旋转！</w:t>
@@ -23159,7 +23159,7 @@
           <w:rFonts w:ascii="Times New Roman" w:hAnsi="Times New Roman" w:eastAsia="微软雅黑"/>
           <w:b/>
           <w:i w:val="0"/>
-          <w:color w:val="1F3964"/>
+          <w:color w:val="4E7EBA"/>
           <w:sz w:val="24"/>
         </w:rPr>
         <w:t>具体怎么旋转？</w:t>
@@ -23265,7 +23265,7 @@
           <w:rFonts w:ascii="Times New Roman" w:hAnsi="Times New Roman" w:eastAsia="微软雅黑"/>
           <w:b/>
           <w:i w:val="0"/>
-          <w:color w:val="1F3964"/>
+          <w:color w:val="4E7EBA"/>
           <w:sz w:val="24"/>
         </w:rPr>
         <w:t>怎么实现？</w:t>
@@ -23442,7 +23442,7 @@
           <w:rFonts w:ascii="Times New Roman" w:hAnsi="Times New Roman" w:eastAsia="微软雅黑"/>
           <w:b/>
           <w:i w:val="0"/>
-          <w:color w:val="1F3964"/>
+          <w:color w:val="4E7EBA"/>
           <w:sz w:val="32"/>
         </w:rPr>
         <w:t>3.5 注意力变体：让推理更快</w:t>
@@ -23458,7 +23458,7 @@
           <w:rFonts w:ascii="Times New Roman" w:hAnsi="Times New Roman" w:eastAsia="微软雅黑"/>
           <w:b/>
           <w:i w:val="0"/>
-          <w:color w:val="1F3964"/>
+          <w:color w:val="4E7EBA"/>
           <w:sz w:val="27"/>
         </w:rPr>
         <w:t>什么是 KV Cache？</w:t>
@@ -23506,7 +23506,7 @@
           <w:rFonts w:ascii="Times New Roman" w:hAnsi="Times New Roman" w:eastAsia="微软雅黑"/>
           <w:b/>
           <w:i w:val="0"/>
-          <w:color w:val="1F3964"/>
+          <w:color w:val="4E7EBA"/>
           <w:sz w:val="24"/>
         </w:rPr>
         <w:t>推理时的问题</w:t>
@@ -23677,7 +23677,7 @@
           <w:rFonts w:ascii="Times New Roman" w:hAnsi="Times New Roman" w:eastAsia="微软雅黑"/>
           <w:b/>
           <w:i w:val="0"/>
-          <w:color w:val="1F3964"/>
+          <w:color w:val="4E7EBA"/>
           <w:sz w:val="24"/>
         </w:rPr>
         <w:t>KV Cache 为什么重要？</w:t>
@@ -23805,7 +23805,7 @@
           <w:rFonts w:ascii="Times New Roman" w:hAnsi="Times New Roman" w:eastAsia="微软雅黑"/>
           <w:b/>
           <w:i w:val="0"/>
-          <w:color w:val="1F3964"/>
+          <w:color w:val="4E7EBA"/>
           <w:sz w:val="27"/>
         </w:rPr>
         <w:t>MQA / GQA：减少 KV 头数</w:t>
@@ -23867,7 +23867,7 @@
           <w:rFonts w:ascii="Times New Roman" w:hAnsi="Times New Roman" w:eastAsia="微软雅黑"/>
           <w:b/>
           <w:i w:val="0"/>
-          <w:color w:val="1F3964"/>
+          <w:color w:val="4E7EBA"/>
           <w:sz w:val="24"/>
         </w:rPr>
         <w:t>MQA（Multi-Query Attention，多查询注意力）</w:t>
@@ -24044,7 +24044,7 @@
           <w:rFonts w:ascii="Times New Roman" w:hAnsi="Times New Roman" w:eastAsia="微软雅黑"/>
           <w:b/>
           <w:i w:val="0"/>
-          <w:color w:val="1F3964"/>
+          <w:color w:val="4E7EBA"/>
           <w:sz w:val="24"/>
         </w:rPr>
         <w:t>GQA（Grouped-Query Attention，分组查询注意力）</w:t>
@@ -24334,7 +24334,7 @@
           <w:rFonts w:ascii="Times New Roman" w:hAnsi="Times New Roman" w:eastAsia="微软雅黑"/>
           <w:b/>
           <w:i w:val="0"/>
-          <w:color w:val="1F3964"/>
+          <w:color w:val="4E7EBA"/>
           <w:sz w:val="24"/>
         </w:rPr>
         <w:t>MLA（Multi-head Latent Attention）</w:t>
@@ -24364,7 +24364,7 @@
           <w:rFonts w:ascii="Times New Roman" w:hAnsi="Times New Roman" w:eastAsia="微软雅黑"/>
           <w:b/>
           <w:i w:val="0"/>
-          <w:color w:val="1F3964"/>
+          <w:color w:val="4E7EBA"/>
           <w:sz w:val="27"/>
         </w:rPr>
         <w:t>稀疏 / 滑动窗口注意力</w:t>
@@ -24426,7 +24426,7 @@
           <w:rFonts w:ascii="Times New Roman" w:hAnsi="Times New Roman" w:eastAsia="微软雅黑"/>
           <w:b/>
           <w:i w:val="0"/>
-          <w:color w:val="1F3964"/>
+          <w:color w:val="4E7EBA"/>
           <w:sz w:val="24"/>
         </w:rPr>
         <w:t>滑动窗口注意力（Sliding Window Attention, SWA）</w:t>
@@ -24537,7 +24537,7 @@
           <w:rFonts w:ascii="Times New Roman" w:hAnsi="Times New Roman" w:eastAsia="微软雅黑"/>
           <w:b/>
           <w:i w:val="0"/>
-          <w:color w:val="1F3964"/>
+          <w:color w:val="4E7EBA"/>
           <w:sz w:val="24"/>
         </w:rPr>
         <w:t>混合注意力（当前主流）</w:t>
@@ -24804,7 +24804,7 @@
           <w:rFonts w:ascii="Times New Roman" w:hAnsi="Times New Roman" w:eastAsia="微软雅黑"/>
           <w:b/>
           <w:i w:val="0"/>
-          <w:color w:val="1F3964"/>
+          <w:color w:val="4E7EBA"/>
           <w:sz w:val="32"/>
         </w:rPr>
         <w:t>3.6 超参数：那些"经验法则"是怎么来的？</w:t>
@@ -24848,7 +24848,7 @@
           <w:rFonts w:ascii="Times New Roman" w:hAnsi="Times New Roman" w:eastAsia="微软雅黑"/>
           <w:b/>
           <w:i w:val="0"/>
-          <w:color w:val="1F3964"/>
+          <w:color w:val="4E7EBA"/>
           <w:sz w:val="27"/>
         </w:rPr>
         <w:t>1. FFN 比例：d_ff / d_model</w:t>
@@ -24887,7 +24887,7 @@
           <w:rFonts w:ascii="Times New Roman" w:hAnsi="Times New Roman" w:eastAsia="微软雅黑"/>
           <w:b/>
           <w:i w:val="0"/>
-          <w:color w:val="1F3964"/>
+          <w:color w:val="4E7EBA"/>
           <w:sz w:val="24"/>
         </w:rPr>
         <w:t>经验法则</w:t>
@@ -24971,7 +24971,7 @@
           <w:rFonts w:ascii="Times New Roman" w:hAnsi="Times New Roman" w:eastAsia="微软雅黑"/>
           <w:b/>
           <w:i w:val="0"/>
-          <w:color w:val="1F3964"/>
+          <w:color w:val="4E7EBA"/>
           <w:sz w:val="24"/>
         </w:rPr>
         <w:t>实际模型的数据</w:t>
@@ -25429,7 +25429,7 @@
           <w:rFonts w:ascii="Times New Roman" w:hAnsi="Times New Roman" w:eastAsia="微软雅黑"/>
           <w:b/>
           <w:i w:val="0"/>
-          <w:color w:val="1F3964"/>
+          <w:color w:val="4E7EBA"/>
           <w:sz w:val="24"/>
         </w:rPr>
         <w:t>为什么是这个范围？</w:t>
@@ -25551,7 +25551,7 @@
           <w:rFonts w:ascii="Times New Roman" w:hAnsi="Times New Roman" w:eastAsia="微软雅黑"/>
           <w:b/>
           <w:i w:val="0"/>
-          <w:color w:val="1F3964"/>
+          <w:color w:val="4E7EBA"/>
           <w:sz w:val="27"/>
         </w:rPr>
         <w:t>2. Head 比例：num_heads × head_dim / d_model</w:t>
@@ -25590,7 +25590,7 @@
           <w:rFonts w:ascii="Times New Roman" w:hAnsi="Times New Roman" w:eastAsia="微软雅黑"/>
           <w:b/>
           <w:i w:val="0"/>
-          <w:color w:val="1F3964"/>
+          <w:color w:val="4E7EBA"/>
           <w:sz w:val="24"/>
         </w:rPr>
         <w:t>经验法则</w:t>
@@ -25637,7 +25637,7 @@
           <w:rFonts w:ascii="Times New Roman" w:hAnsi="Times New Roman" w:eastAsia="微软雅黑"/>
           <w:b/>
           <w:i w:val="0"/>
-          <w:color w:val="1F3964"/>
+          <w:color w:val="4E7EBA"/>
           <w:sz w:val="24"/>
         </w:rPr>
         <w:t>实际模型的数据</w:t>
@@ -26051,7 +26051,7 @@
           <w:rFonts w:ascii="Times New Roman" w:hAnsi="Times New Roman" w:eastAsia="微软雅黑"/>
           <w:b/>
           <w:i w:val="0"/>
-          <w:color w:val="1F3964"/>
+          <w:color w:val="4E7EBA"/>
           <w:sz w:val="27"/>
         </w:rPr>
         <w:t>3. 宽深比（Aspect Ratio）：d_model / num_layers</w:t>
@@ -26090,7 +26090,7 @@
           <w:rFonts w:ascii="Times New Roman" w:hAnsi="Times New Roman" w:eastAsia="微软雅黑"/>
           <w:b/>
           <w:i w:val="0"/>
-          <w:color w:val="1F3964"/>
+          <w:color w:val="4E7EBA"/>
           <w:sz w:val="24"/>
         </w:rPr>
         <w:t>定义</w:t>
@@ -26171,7 +26171,7 @@
           <w:rFonts w:ascii="Times New Roman" w:hAnsi="Times New Roman" w:eastAsia="微软雅黑"/>
           <w:b/>
           <w:i w:val="0"/>
-          <w:color w:val="1F3964"/>
+          <w:color w:val="4E7EBA"/>
           <w:sz w:val="24"/>
         </w:rPr>
         <w:t>实际模型的数据</w:t>
@@ -26589,7 +26589,7 @@
           <w:rFonts w:ascii="Times New Roman" w:hAnsi="Times New Roman" w:eastAsia="微软雅黑"/>
           <w:b/>
           <w:i w:val="0"/>
-          <w:color w:val="1F3964"/>
+          <w:color w:val="4E7EBA"/>
           <w:sz w:val="24"/>
         </w:rPr>
         <w:t>为什么不是越深越好？</w:t>
@@ -26831,7 +26831,7 @@
           <w:rFonts w:ascii="Times New Roman" w:hAnsi="Times New Roman" w:eastAsia="微软雅黑"/>
           <w:b/>
           <w:i w:val="0"/>
-          <w:color w:val="1F3964"/>
+          <w:color w:val="4E7EBA"/>
           <w:sz w:val="27"/>
         </w:rPr>
         <w:t>4. 词表大小</w:t>
@@ -26870,7 +26870,7 @@
           <w:rFonts w:ascii="Times New Roman" w:hAnsi="Times New Roman" w:eastAsia="微软雅黑"/>
           <w:b/>
           <w:i w:val="0"/>
-          <w:color w:val="1F3964"/>
+          <w:color w:val="4E7EBA"/>
           <w:sz w:val="24"/>
         </w:rPr>
         <w:t>经验法则</w:t>
@@ -26952,7 +26952,7 @@
           <w:rFonts w:ascii="Times New Roman" w:hAnsi="Times New Roman" w:eastAsia="微软雅黑"/>
           <w:b/>
           <w:i w:val="0"/>
-          <w:color w:val="1F3964"/>
+          <w:color w:val="4E7EBA"/>
           <w:sz w:val="24"/>
         </w:rPr>
         <w:t>实际模型的数据</w:t>
@@ -27608,7 +27608,7 @@
           <w:rFonts w:ascii="Times New Roman" w:hAnsi="Times New Roman" w:eastAsia="微软雅黑"/>
           <w:b/>
           <w:i w:val="0"/>
-          <w:color w:val="1F3964"/>
+          <w:color w:val="4E7EBA"/>
           <w:sz w:val="27"/>
         </w:rPr>
         <w:t>5. 正则化：大模型还需要 dropout 吗？</w:t>
@@ -27624,7 +27624,7 @@
           <w:rFonts w:ascii="Times New Roman" w:hAnsi="Times New Roman" w:eastAsia="微软雅黑"/>
           <w:b/>
           <w:i w:val="0"/>
-          <w:color w:val="1F3964"/>
+          <w:color w:val="4E7EBA"/>
           <w:sz w:val="24"/>
         </w:rPr>
         <w:t>Dropout</w:t>
@@ -28156,7 +28156,7 @@
           <w:rFonts w:ascii="Times New Roman" w:hAnsi="Times New Roman" w:eastAsia="微软雅黑"/>
           <w:b/>
           <w:i w:val="0"/>
-          <w:color w:val="1F3964"/>
+          <w:color w:val="4E7EBA"/>
           <w:sz w:val="24"/>
         </w:rPr>
         <w:t>Weight Decay（权重衰减）</w:t>
@@ -28311,7 +28311,7 @@
           <w:rFonts w:ascii="Times New Roman" w:hAnsi="Times New Roman" w:eastAsia="微软雅黑"/>
           <w:b/>
           <w:i w:val="0"/>
-          <w:color w:val="1F3964"/>
+          <w:color w:val="4E7EBA"/>
           <w:sz w:val="32"/>
         </w:rPr>
         <w:t>3.7 训练稳定性：为什么损失会突然飙升？</w:t>
@@ -28327,7 +28327,7 @@
           <w:rFonts w:ascii="Times New Roman" w:hAnsi="Times New Roman" w:eastAsia="微软雅黑"/>
           <w:b/>
           <w:i w:val="0"/>
-          <w:color w:val="1F3964"/>
+          <w:color w:val="4E7EBA"/>
           <w:sz w:val="27"/>
         </w:rPr>
         <w:t>问题：训练不稳定</w:t>
@@ -28478,7 +28478,7 @@
           <w:rFonts w:ascii="Times New Roman" w:hAnsi="Times New Roman" w:eastAsia="微软雅黑"/>
           <w:b/>
           <w:i w:val="0"/>
-          <w:color w:val="1F3964"/>
+          <w:color w:val="4E7EBA"/>
           <w:sz w:val="27"/>
         </w:rPr>
         <w:t>Softmax 为什么是"罪魁祸首"？</w:t>
@@ -28732,7 +28732,7 @@
           <w:rFonts w:ascii="Times New Roman" w:hAnsi="Times New Roman" w:eastAsia="微软雅黑"/>
           <w:b/>
           <w:i w:val="0"/>
-          <w:color w:val="1F3964"/>
+          <w:color w:val="4E7EBA"/>
           <w:sz w:val="27"/>
         </w:rPr>
         <w:t>技巧 1：Z-Loss（输出 softmax 稳定性）</w:t>
@@ -28933,7 +28933,7 @@
           <w:rFonts w:ascii="Times New Roman" w:hAnsi="Times New Roman" w:eastAsia="微软雅黑"/>
           <w:b/>
           <w:i w:val="0"/>
-          <w:color w:val="1F3964"/>
+          <w:color w:val="4E7EBA"/>
           <w:sz w:val="27"/>
         </w:rPr>
         <w:t>技巧 2：QK-Norm（注意力 softmax 稳定性）</w:t>
@@ -29157,7 +29157,7 @@
           <w:rFonts w:ascii="Times New Roman" w:hAnsi="Times New Roman" w:eastAsia="微软雅黑"/>
           <w:b/>
           <w:i w:val="0"/>
-          <w:color w:val="1F3964"/>
+          <w:color w:val="4E7EBA"/>
           <w:sz w:val="27"/>
         </w:rPr>
         <w:t>技巧 3：Logit Soft-Capping</w:t>
@@ -29298,7 +29298,7 @@
           <w:rFonts w:ascii="Times New Roman" w:hAnsi="Times New Roman" w:eastAsia="微软雅黑"/>
           <w:b/>
           <w:i w:val="0"/>
-          <w:color w:val="1F3964"/>
+          <w:color w:val="4E7EBA"/>
           <w:sz w:val="32"/>
         </w:rPr>
         <w:t>3.8 架构设计三原则</w:t>
@@ -29328,7 +29328,7 @@
           <w:rFonts w:ascii="Times New Roman" w:hAnsi="Times New Roman" w:eastAsia="微软雅黑"/>
           <w:b/>
           <w:i w:val="0"/>
-          <w:color w:val="1F3964"/>
+          <w:color w:val="4E7EBA"/>
           <w:sz w:val="27"/>
         </w:rPr>
         <w:t>1. 表达性（Expressivity）</w:t>
@@ -29430,7 +29430,7 @@
           <w:rFonts w:ascii="Times New Roman" w:hAnsi="Times New Roman" w:eastAsia="微软雅黑"/>
           <w:b/>
           <w:i w:val="0"/>
-          <w:color w:val="1F3964"/>
+          <w:color w:val="4E7EBA"/>
           <w:sz w:val="27"/>
         </w:rPr>
         <w:t>2. 稳定性（Stability）</w:t>
@@ -29532,7 +29532,7 @@
           <w:rFonts w:ascii="Times New Roman" w:hAnsi="Times New Roman" w:eastAsia="微软雅黑"/>
           <w:b/>
           <w:i w:val="0"/>
-          <w:color w:val="1F3964"/>
+          <w:color w:val="4E7EBA"/>
           <w:sz w:val="27"/>
         </w:rPr>
         <w:t>3. 效率（Efficiency）</w:t>
@@ -29736,7 +29736,7 @@
           <w:rFonts w:ascii="Times New Roman" w:hAnsi="Times New Roman" w:eastAsia="微软雅黑"/>
           <w:b/>
           <w:i w:val="0"/>
-          <w:color w:val="1F3964"/>
+          <w:color w:val="4E7EBA"/>
           <w:sz w:val="32"/>
         </w:rPr>
         <w:t>3.9 小白常见问题 Q&amp;A</w:t>
@@ -29752,7 +29752,7 @@
           <w:rFonts w:ascii="Times New Roman" w:hAnsi="Times New Roman" w:eastAsia="微软雅黑"/>
           <w:b/>
           <w:i w:val="0"/>
-          <w:color w:val="1F3964"/>
+          <w:color w:val="4E7EBA"/>
           <w:sz w:val="27"/>
         </w:rPr>
         <w:t>Q：为什么大家都抄 LLaMA 的架构？</w:t>
@@ -29918,7 +29918,7 @@
           <w:rFonts w:ascii="Times New Roman" w:hAnsi="Times New Roman" w:eastAsia="微软雅黑"/>
           <w:b/>
           <w:i w:val="0"/>
-          <w:color w:val="1F3964"/>
+          <w:color w:val="4E7EBA"/>
           <w:sz w:val="27"/>
         </w:rPr>
         <w:t>Q：架构创新还有意义吗？</w:t>
@@ -30057,7 +30057,7 @@
           <w:rFonts w:ascii="Times New Roman" w:hAnsi="Times New Roman" w:eastAsia="微软雅黑"/>
           <w:b/>
           <w:i w:val="0"/>
-          <w:color w:val="1F3964"/>
+          <w:color w:val="4E7EBA"/>
           <w:sz w:val="27"/>
         </w:rPr>
         <w:t>Q：我做项目应该选什么配置？</w:t>
@@ -30245,7 +30245,7 @@
           <w:rFonts w:ascii="Times New Roman" w:hAnsi="Times New Roman" w:eastAsia="微软雅黑"/>
           <w:b/>
           <w:i w:val="0"/>
-          <w:color w:val="1F3964"/>
+          <w:color w:val="4E7EBA"/>
           <w:sz w:val="27"/>
         </w:rPr>
         <w:t>Q：为什么训练会不稳定？怎么解决？</w:t>
@@ -30457,7 +30457,7 @@
           <w:rFonts w:ascii="Times New Roman" w:hAnsi="Times New Roman" w:eastAsia="微软雅黑"/>
           <w:b/>
           <w:i w:val="0"/>
-          <w:color w:val="1F3964"/>
+          <w:color w:val="4E7EBA"/>
           <w:sz w:val="32"/>
         </w:rPr>
         <w:t>3.10 第三讲学习路线图</w:t>
@@ -30473,7 +30473,7 @@
           <w:rFonts w:ascii="Times New Roman" w:hAnsi="Times New Roman" w:eastAsia="微软雅黑"/>
           <w:b/>
           <w:i w:val="0"/>
-          <w:color w:val="1F3964"/>
+          <w:color w:val="4E7EBA"/>
           <w:sz w:val="27"/>
         </w:rPr>
         <w:t>你应该掌握到什么程度？</w:t>
@@ -30775,7 +30775,7 @@
           <w:rFonts w:ascii="Times New Roman" w:hAnsi="Times New Roman" w:eastAsia="微软雅黑"/>
           <w:b/>
           <w:i w:val="0"/>
-          <w:color w:val="1F3964"/>
+          <w:color w:val="4E7EBA"/>
           <w:sz w:val="27"/>
         </w:rPr>
         <w:t>怎么配合作业 1 学习？</w:t>
@@ -30913,7 +30913,7 @@
           <w:rFonts w:ascii="Times New Roman" w:hAnsi="Times New Roman" w:eastAsia="微软雅黑"/>
           <w:b/>
           <w:i w:val="0"/>
-          <w:color w:val="1F3964"/>
+          <w:color w:val="4E7EBA"/>
           <w:sz w:val="32"/>
         </w:rPr>
         <w:t>📋 附录：关键公式速查表（带解释）</w:t>
@@ -30929,7 +30929,7 @@
           <w:rFonts w:ascii="Times New Roman" w:hAnsi="Times New Roman" w:eastAsia="微软雅黑"/>
           <w:b/>
           <w:i w:val="0"/>
-          <w:color w:val="1F3964"/>
+          <w:color w:val="4E7EBA"/>
           <w:sz w:val="27"/>
         </w:rPr>
         <w:t>Tokenization</w:t>
@@ -31045,7 +31045,7 @@
           <w:rFonts w:ascii="Times New Roman" w:hAnsi="Times New Roman" w:eastAsia="微软雅黑"/>
           <w:b/>
           <w:i w:val="0"/>
-          <w:color w:val="1F3964"/>
+          <w:color w:val="4E7EBA"/>
           <w:sz w:val="27"/>
         </w:rPr>
         <w:t>资源核算</w:t>
@@ -31366,7 +31366,7 @@
           <w:rFonts w:ascii="Times New Roman" w:hAnsi="Times New Roman" w:eastAsia="微软雅黑"/>
           <w:b/>
           <w:i w:val="0"/>
-          <w:color w:val="1F3964"/>
+          <w:color w:val="4E7EBA"/>
           <w:sz w:val="27"/>
         </w:rPr>
         <w:t>架构</w:t>
@@ -31721,7 +31721,7 @@
           <w:rFonts w:ascii="Times New Roman" w:hAnsi="Times New Roman" w:eastAsia="微软雅黑"/>
           <w:b/>
           <w:i w:val="0"/>
-          <w:color w:val="1F3964"/>
+          <w:color w:val="4E7EBA"/>
           <w:sz w:val="32"/>
         </w:rPr>
         <w:t>🎯 三讲核心思想总结</w:t>
@@ -32557,7 +32557,7 @@
       <w:rFonts w:asciiTheme="majorHAnsi" w:eastAsiaTheme="majorEastAsia" w:hAnsiTheme="majorHAnsi" w:cstheme="majorBidi" w:eastAsia="微软雅黑"/>
       <w:b/>
       <w:bCs/>
-      <w:color w:val="365F91" w:themeColor="accent1" w:themeShade="BF"/>
+      <w:color w:val="4E7EBA"/>
       <w:sz w:val="28"/>
       <w:szCs w:val="28"/>
     </w:rPr>
@@ -32581,7 +32581,7 @@
       <w:rFonts w:asciiTheme="majorHAnsi" w:eastAsiaTheme="majorEastAsia" w:hAnsiTheme="majorHAnsi" w:cstheme="majorBidi" w:eastAsia="微软雅黑"/>
       <w:b/>
       <w:bCs/>
-      <w:color w:val="4F81BD" w:themeColor="accent1"/>
+      <w:color w:val="4E7EBA"/>
       <w:sz w:val="26"/>
       <w:szCs w:val="26"/>
     </w:rPr>
@@ -32605,7 +32605,7 @@
       <w:rFonts w:asciiTheme="majorHAnsi" w:eastAsiaTheme="majorEastAsia" w:hAnsiTheme="majorHAnsi" w:cstheme="majorBidi" w:eastAsia="微软雅黑"/>
       <w:b/>
       <w:bCs/>
-      <w:color w:val="4F81BD" w:themeColor="accent1"/>
+      <w:color w:val="4E7EBA"/>
     </w:rPr>
   </w:style>
   <w:style w:type="paragraph" w:styleId="Heading4">
@@ -32630,7 +32630,7 @@
       <w:bCs/>
       <w:i/>
       <w:iCs/>
-      <w:color w:val="4F81BD" w:themeColor="accent1"/>
+      <w:color w:val="4E7EBA"/>
     </w:rPr>
   </w:style>
   <w:style w:type="paragraph" w:styleId="Heading5">

</xml_diff>